<commit_message>
fix(ah): replace header with title + blue line + logo layout
Generator now writes custom header2/header3 XML into Angebot-AH.docx:
- Left: "EmC2  Alltagshilfe" bold title (dark, letter-spaced)
- Right: emc² logo (same image reference as HL template)
- Blue horizontal separator line (#2E74B5) spanning full header width

Both the main header (header2) and first-page header (header3) are replaced,
so all pages show the correct AH branding instead of the inherited HL header.

Co-Authored-By: Claude Sonnet 4.6 (1M context) <noreply@anthropic.com>
</commit_message>
<xml_diff>
--- a/src/templates/Angebot-AH.docx
+++ b/src/templates/Angebot-AH.docx
@@ -2496,116 +2496,276 @@
 </file>
 
 <file path=word/header2.xml><?xml version="1.0" encoding="utf-8"?>
-<w:hdr xmlns:wpc="http://schemas.microsoft.com/office/word/2010/wordprocessingCanvas" xmlns:cx="http://schemas.microsoft.com/office/drawing/2014/chartex" xmlns:cx1="http://schemas.microsoft.com/office/drawing/2015/9/8/chartex" xmlns:cx2="http://schemas.microsoft.com/office/drawing/2015/10/21/chartex" xmlns:cx3="http://schemas.microsoft.com/office/drawing/2016/5/9/chartex" xmlns:cx4="http://schemas.microsoft.com/office/drawing/2016/5/10/chartex" xmlns:cx5="http://schemas.microsoft.com/office/drawing/2016/5/11/chartex" xmlns:cx6="http://schemas.microsoft.com/office/drawing/2016/5/12/chartex" xmlns:cx7="http://schemas.microsoft.com/office/drawing/2016/5/13/chartex" xmlns:cx8="http://schemas.microsoft.com/office/drawing/2016/5/14/chartex" xmlns:mc="http://schemas.openxmlformats.org/markup-compatibility/2006" xmlns:aink="http://schemas.microsoft.com/office/drawing/2016/ink" xmlns:am3d="http://schemas.microsoft.com/office/drawing/2017/model3d" xmlns:o="urn:schemas-microsoft-com:office:office" xmlns:oel="http://schemas.microsoft.com/office/2019/extlst" xmlns:r="http://schemas.openxmlformats.org/officeDocument/2006/relationships" xmlns:m="http://schemas.openxmlformats.org/officeDocument/2006/math" xmlns:v="urn:schemas-microsoft-com:vml" xmlns:wp14="http://schemas.microsoft.com/office/word/2010/wordprocessingDrawing" xmlns:wp="http://schemas.openxmlformats.org/drawingml/2006/wordprocessingDrawing" xmlns:w10="urn:schemas-microsoft-com:office:word" xmlns:w="http://schemas.openxmlformats.org/wordprocessingml/2006/main" xmlns:w14="http://schemas.microsoft.com/office/word/2010/wordml" xmlns:w15="http://schemas.microsoft.com/office/word/2012/wordml" xmlns:w16cex="http://schemas.microsoft.com/office/word/2018/wordml/cex" xmlns:w16cid="http://schemas.microsoft.com/office/word/2016/wordml/cid" xmlns:w16="http://schemas.microsoft.com/office/word/2018/wordml" xmlns:w16du="http://schemas.microsoft.com/office/word/2023/wordml/word16du" xmlns:w16sdtdh="http://schemas.microsoft.com/office/word/2020/wordml/sdtdatahash" xmlns:w16sdtfl="http://schemas.microsoft.com/office/word/2024/wordml/sdtformatlock" xmlns:w16se="http://schemas.microsoft.com/office/word/2015/wordml/symex" xmlns:wpg="http://schemas.microsoft.com/office/word/2010/wordprocessingGroup" xmlns:wpi="http://schemas.microsoft.com/office/word/2010/wordprocessingInk" xmlns:wne="http://schemas.microsoft.com/office/word/2006/wordml" xmlns:wps="http://schemas.microsoft.com/office/word/2010/wordprocessingShape" mc:Ignorable="w14 w15 w16se w16cid w16 w16cex w16sdtdh w16sdtfl w16du wp14">
+<w:hdr xmlns:wpc="http://schemas.microsoft.com/office/word/2010/wordprocessingCanvas" xmlns:mc="http://schemas.openxmlformats.org/markup-compatibility/2006" xmlns:r="http://schemas.openxmlformats.org/officeDocument/2006/relationships" xmlns:m="http://schemas.openxmlformats.org/officeDocument/2006/math" xmlns:wp="http://schemas.openxmlformats.org/drawingml/2006/wordprocessingDrawing" xmlns:w="http://schemas.openxmlformats.org/wordprocessingml/2006/main" xmlns:w14="http://schemas.microsoft.com/office/word/2010/wordml" xmlns:w15="http://schemas.microsoft.com/office/word/2012/wordml" xmlns:w16cex="http://schemas.microsoft.com/office/word/2018/wordml/cex" xmlns:w16cid="http://schemas.microsoft.com/office/word/2016/wordml/cid" xmlns:w16="http://schemas.microsoft.com/office/word/2018/wordml" xmlns:w16du="http://schemas.microsoft.com/office/word/2023/wordml/word16du" xmlns:w16sdtdh="http://schemas.microsoft.com/office/word/2020/wordml/sdtdatahash" xmlns:w16se="http://schemas.microsoft.com/office/word/2015/wordml/symex" xmlns:wpg="http://schemas.microsoft.com/office/word/2010/wordprocessingGroup" xmlns:wpi="http://schemas.microsoft.com/office/word/2010/wordprocessingInk" xmlns:wne="http://schemas.microsoft.com/office/word/2006/wordml" xmlns:wps="http://schemas.microsoft.com/office/word/2010/wordprocessingShape" mc:Ignorable="w14 w15 w16se w16cid w16 w16cex w16sdtdh w16du">
   <w:p>
     <w:pPr>
       <w:pStyle w:val="normal1"/>
     </w:pPr>
   </w:p>
-  <w:p>
-    <w:pPr>
-      <w:pStyle w:val="normal1"/>
-      <w:spacing w:before="120"/>
-      <w:ind w:left="7200"/>
-    </w:pPr>
-    <w:r>
-      <w:rPr>
-        <w:noProof/>
-      </w:rPr>
-      <w:drawing>
-        <wp:inline distT="0" distB="0" distL="0" distR="0" wp14:anchorId="71B4AA77" wp14:editId="3AFC90C4">
-          <wp:extent cx="1585595" cy="920750"/>
-          <wp:effectExtent l="0" t="0" r="0" b="0"/>
-          <wp:docPr id="2" name="image1.jpg"/>
-          <wp:cNvGraphicFramePr/>
-          <a:graphic xmlns:a="http://schemas.openxmlformats.org/drawingml/2006/main">
-            <a:graphicData uri="http://schemas.openxmlformats.org/drawingml/2006/picture">
-              <pic:pic xmlns:pic="http://schemas.openxmlformats.org/drawingml/2006/picture">
-                <pic:nvPicPr>
-                  <pic:cNvPr id="0" name=""/>
-                  <pic:cNvPicPr>
-                    <a:picLocks noChangeAspect="1" noChangeArrowheads="1"/>
-                  </pic:cNvPicPr>
-                </pic:nvPicPr>
-                <pic:blipFill>
-                  <a:blip r:embed="rId1"/>
-                  <a:stretch>
-                    <a:fillRect/>
-                  </a:stretch>
-                </pic:blipFill>
-                <pic:spPr bwMode="auto">
-                  <a:xfrm>
-                    <a:off x="0" y="0"/>
-                    <a:ext cx="1585595" cy="920750"/>
-                  </a:xfrm>
-                  <a:prstGeom prst="rect">
-                    <a:avLst/>
-                  </a:prstGeom>
-                </pic:spPr>
-              </pic:pic>
-            </a:graphicData>
-          </a:graphic>
-        </wp:inline>
-      </w:drawing>
-    </w:r>
-  </w:p>
+  <w:tbl>
+    <w:tblPr>
+      <w:tblStyle w:val="NormalTable0"/>
+      <w:tblW w:w="9360" w:type="dxa"/>
+      <w:tblInd w:w="0" w:type="dxa"/>
+      <w:tblLayout w:type="fixed"/>
+      <w:tblCellMar>
+        <w:left w:w="0" w:type="dxa"/>
+        <w:right w:w="0" w:type="dxa"/>
+      </w:tblCellMar>
+    </w:tblPr>
+    <w:tblGrid>
+      <w:gridCol w:w="7200"/>
+      <w:gridCol w:w="2160"/>
+    </w:tblGrid>
+    <w:tr>
+      <w:trPr/>
+      <w:tc>
+        <w:tcPr>
+          <w:tcW w:w="7200" w:type="dxa"/>
+          <w:tcBorders>
+            <w:top w:val="none"/>
+            <w:left w:val="none"/>
+            <w:bottom w:val="single" w:sz="12" w:space="0" w:color="2E74B5"/>
+            <w:right w:val="none"/>
+          </w:tcBorders>
+          <w:tcMar>
+            <w:top w:w="0" w:type="dxa"/>
+            <w:left w:w="0" w:type="dxa"/>
+            <w:bottom w:w="60" w:type="dxa"/>
+            <w:right w:w="0" w:type="dxa"/>
+          </w:tcMar>
+          <w:vAlign w:val="bottom"/>
+        </w:tcPr>
+        <w:p>
+          <w:pPr>
+            <w:spacing w:before="0" w:after="80"/>
+            <w:rPr>
+              <w:rFonts w:ascii="Open Sans" w:eastAsia="Open Sans" w:hAnsi="Open Sans" w:cs="Open Sans"/>
+              <w:b/>
+              <w:bCs/>
+              <w:color w:val="1F2D3D"/>
+              <w:sz w:val="28"/>
+              <w:szCs w:val="28"/>
+              <w:spacing w:val="100"/>
+            </w:rPr>
+          </w:pPr>
+          <w:r>
+            <w:rPr>
+              <w:rFonts w:ascii="Open Sans" w:eastAsia="Open Sans" w:hAnsi="Open Sans" w:cs="Open Sans"/>
+              <w:b/>
+              <w:bCs/>
+              <w:color w:val="1F2D3D"/>
+              <w:sz w:val="28"/>
+              <w:szCs w:val="28"/>
+              <w:spacing w:val="100"/>
+            </w:rPr>
+            <w:t xml:space="preserve">EmC2  Alltagshilfe</w:t>
+          </w:r>
+        </w:p>
+      </w:tc>
+      <w:tc>
+        <w:tcPr>
+          <w:tcW w:w="2160" w:type="dxa"/>
+          <w:tcBorders>
+            <w:top w:val="none"/>
+            <w:left w:val="none"/>
+            <w:bottom w:val="single" w:sz="12" w:space="0" w:color="2E74B5"/>
+            <w:right w:val="none"/>
+          </w:tcBorders>
+          <w:tcMar>
+            <w:top w:w="0" w:type="dxa"/>
+            <w:left w:w="0" w:type="dxa"/>
+            <w:bottom w:w="0" w:type="dxa"/>
+            <w:right w:w="0" w:type="dxa"/>
+          </w:tcMar>
+          <w:vAlign w:val="bottom"/>
+        </w:tcPr>
+        <w:p>
+          <w:pPr>
+            <w:jc w:val="right"/>
+            <w:spacing w:before="0" w:after="0"/>
+          </w:pPr>
+          <w:r>
+            <w:rPr>
+              <w:noProof/>
+            </w:rPr>
+            <w:drawing>
+              <wp:inline xmlns:wp="http://schemas.openxmlformats.org/drawingml/2006/wordprocessingDrawing" distT="0" distB="0" distL="0" distR="0">
+                <wp:extent cx="1585595" cy="920750"/>
+                <wp:effectExtent l="0" t="0" r="0" b="0"/>
+                <wp:docPr id="2" name="emc2-logo.jpg"/>
+                <wp:cNvGraphicFramePr/>
+                <a:graphic xmlns:a="http://schemas.openxmlformats.org/drawingml/2006/main">
+                  <a:graphicData uri="http://schemas.openxmlformats.org/drawingml/2006/picture">
+                    <pic:pic xmlns:pic="http://schemas.openxmlformats.org/drawingml/2006/picture">
+                      <pic:nvPicPr>
+                        <pic:cNvPr id="0" name=""/>
+                        <pic:cNvPicPr>
+                          <a:picLocks noChangeAspect="1" noChangeArrowheads="1"/>
+                        </pic:cNvPicPr>
+                      </pic:nvPicPr>
+                      <pic:blipFill>
+                        <a:blip r:embed="rId1"/>
+                        <a:stretch>
+                          <a:fillRect/>
+                        </a:stretch>
+                      </pic:blipFill>
+                      <pic:spPr bwMode="auto">
+                        <a:xfrm>
+                          <a:off x="0" y="0"/>
+                          <a:ext cx="1585595" cy="920750"/>
+                        </a:xfrm>
+                        <a:prstGeom prst="rect">
+                          <a:avLst/>
+                        </a:prstGeom>
+                      </pic:spPr>
+                    </pic:pic>
+                  </a:graphicData>
+                </a:graphic>
+              </wp:inline>
+            </w:drawing>
+          </w:r>
+        </w:p>
+      </w:tc>
+    </w:tr>
+  </w:tbl>
 </w:hdr>
 </file>
 
 <file path=word/header3.xml><?xml version="1.0" encoding="utf-8"?>
-<w:hdr xmlns:wpc="http://schemas.microsoft.com/office/word/2010/wordprocessingCanvas" xmlns:cx="http://schemas.microsoft.com/office/drawing/2014/chartex" xmlns:cx1="http://schemas.microsoft.com/office/drawing/2015/9/8/chartex" xmlns:cx2="http://schemas.microsoft.com/office/drawing/2015/10/21/chartex" xmlns:cx3="http://schemas.microsoft.com/office/drawing/2016/5/9/chartex" xmlns:cx4="http://schemas.microsoft.com/office/drawing/2016/5/10/chartex" xmlns:cx5="http://schemas.microsoft.com/office/drawing/2016/5/11/chartex" xmlns:cx6="http://schemas.microsoft.com/office/drawing/2016/5/12/chartex" xmlns:cx7="http://schemas.microsoft.com/office/drawing/2016/5/13/chartex" xmlns:cx8="http://schemas.microsoft.com/office/drawing/2016/5/14/chartex" xmlns:mc="http://schemas.openxmlformats.org/markup-compatibility/2006" xmlns:aink="http://schemas.microsoft.com/office/drawing/2016/ink" xmlns:am3d="http://schemas.microsoft.com/office/drawing/2017/model3d" xmlns:o="urn:schemas-microsoft-com:office:office" xmlns:oel="http://schemas.microsoft.com/office/2019/extlst" xmlns:r="http://schemas.openxmlformats.org/officeDocument/2006/relationships" xmlns:m="http://schemas.openxmlformats.org/officeDocument/2006/math" xmlns:v="urn:schemas-microsoft-com:vml" xmlns:wp14="http://schemas.microsoft.com/office/word/2010/wordprocessingDrawing" xmlns:wp="http://schemas.openxmlformats.org/drawingml/2006/wordprocessingDrawing" xmlns:w10="urn:schemas-microsoft-com:office:word" xmlns:w="http://schemas.openxmlformats.org/wordprocessingml/2006/main" xmlns:w14="http://schemas.microsoft.com/office/word/2010/wordml" xmlns:w15="http://schemas.microsoft.com/office/word/2012/wordml" xmlns:w16cex="http://schemas.microsoft.com/office/word/2018/wordml/cex" xmlns:w16cid="http://schemas.microsoft.com/office/word/2016/wordml/cid" xmlns:w16="http://schemas.microsoft.com/office/word/2018/wordml" xmlns:w16du="http://schemas.microsoft.com/office/word/2023/wordml/word16du" xmlns:w16sdtdh="http://schemas.microsoft.com/office/word/2020/wordml/sdtdatahash" xmlns:w16sdtfl="http://schemas.microsoft.com/office/word/2024/wordml/sdtformatlock" xmlns:w16se="http://schemas.microsoft.com/office/word/2015/wordml/symex" xmlns:wpg="http://schemas.microsoft.com/office/word/2010/wordprocessingGroup" xmlns:wpi="http://schemas.microsoft.com/office/word/2010/wordprocessingInk" xmlns:wne="http://schemas.microsoft.com/office/word/2006/wordml" xmlns:wps="http://schemas.microsoft.com/office/word/2010/wordprocessingShape" mc:Ignorable="w14 w15 w16se w16cid w16 w16cex w16sdtdh w16sdtfl w16du wp14">
+<w:hdr xmlns:wpc="http://schemas.microsoft.com/office/word/2010/wordprocessingCanvas" xmlns:mc="http://schemas.openxmlformats.org/markup-compatibility/2006" xmlns:r="http://schemas.openxmlformats.org/officeDocument/2006/relationships" xmlns:m="http://schemas.openxmlformats.org/officeDocument/2006/math" xmlns:wp="http://schemas.openxmlformats.org/drawingml/2006/wordprocessingDrawing" xmlns:w="http://schemas.openxmlformats.org/wordprocessingml/2006/main" xmlns:w14="http://schemas.microsoft.com/office/word/2010/wordml" xmlns:w15="http://schemas.microsoft.com/office/word/2012/wordml" xmlns:w16cex="http://schemas.microsoft.com/office/word/2018/wordml/cex" xmlns:w16cid="http://schemas.microsoft.com/office/word/2016/wordml/cid" xmlns:w16="http://schemas.microsoft.com/office/word/2018/wordml" xmlns:w16du="http://schemas.microsoft.com/office/word/2023/wordml/word16du" xmlns:w16sdtdh="http://schemas.microsoft.com/office/word/2020/wordml/sdtdatahash" xmlns:w16se="http://schemas.microsoft.com/office/word/2015/wordml/symex" xmlns:wpg="http://schemas.microsoft.com/office/word/2010/wordprocessingGroup" xmlns:wpi="http://schemas.microsoft.com/office/word/2010/wordprocessingInk" xmlns:wne="http://schemas.microsoft.com/office/word/2006/wordml" xmlns:wps="http://schemas.microsoft.com/office/word/2010/wordprocessingShape" mc:Ignorable="w14 w15 w16se w16cid w16 w16cex w16sdtdh w16du">
   <w:p>
     <w:pPr>
       <w:pStyle w:val="normal1"/>
     </w:pPr>
   </w:p>
-  <w:p>
-    <w:pPr>
-      <w:pStyle w:val="normal1"/>
-      <w:spacing w:before="120"/>
-      <w:ind w:left="7200"/>
-    </w:pPr>
-    <w:r>
-      <w:rPr>
-        <w:noProof/>
-      </w:rPr>
-      <w:drawing>
-        <wp:inline distT="0" distB="0" distL="0" distR="0" wp14:anchorId="064A7AA9" wp14:editId="7250557F">
-          <wp:extent cx="1585595" cy="920750"/>
-          <wp:effectExtent l="0" t="0" r="0" b="0"/>
-          <wp:docPr id="1" name="image1.jpg"/>
-          <wp:cNvGraphicFramePr/>
-          <a:graphic xmlns:a="http://schemas.openxmlformats.org/drawingml/2006/main">
-            <a:graphicData uri="http://schemas.openxmlformats.org/drawingml/2006/picture">
-              <pic:pic xmlns:pic="http://schemas.openxmlformats.org/drawingml/2006/picture">
-                <pic:nvPicPr>
-                  <pic:cNvPr id="0" name=""/>
-                  <pic:cNvPicPr>
-                    <a:picLocks noChangeAspect="1" noChangeArrowheads="1"/>
-                  </pic:cNvPicPr>
-                </pic:nvPicPr>
-                <pic:blipFill>
-                  <a:blip r:embed="rId1"/>
-                  <a:stretch>
-                    <a:fillRect/>
-                  </a:stretch>
-                </pic:blipFill>
-                <pic:spPr bwMode="auto">
-                  <a:xfrm>
-                    <a:off x="0" y="0"/>
-                    <a:ext cx="1585595" cy="920750"/>
-                  </a:xfrm>
-                  <a:prstGeom prst="rect">
-                    <a:avLst/>
-                  </a:prstGeom>
-                </pic:spPr>
-              </pic:pic>
-            </a:graphicData>
-          </a:graphic>
-        </wp:inline>
-      </w:drawing>
-    </w:r>
-  </w:p>
+  <w:tbl>
+    <w:tblPr>
+      <w:tblStyle w:val="NormalTable0"/>
+      <w:tblW w:w="9360" w:type="dxa"/>
+      <w:tblInd w:w="0" w:type="dxa"/>
+      <w:tblLayout w:type="fixed"/>
+      <w:tblCellMar>
+        <w:left w:w="0" w:type="dxa"/>
+        <w:right w:w="0" w:type="dxa"/>
+      </w:tblCellMar>
+    </w:tblPr>
+    <w:tblGrid>
+      <w:gridCol w:w="7200"/>
+      <w:gridCol w:w="2160"/>
+    </w:tblGrid>
+    <w:tr>
+      <w:trPr/>
+      <w:tc>
+        <w:tcPr>
+          <w:tcW w:w="7200" w:type="dxa"/>
+          <w:tcBorders>
+            <w:top w:val="none"/>
+            <w:left w:val="none"/>
+            <w:bottom w:val="single" w:sz="12" w:space="0" w:color="2E74B5"/>
+            <w:right w:val="none"/>
+          </w:tcBorders>
+          <w:tcMar>
+            <w:top w:w="0" w:type="dxa"/>
+            <w:left w:w="0" w:type="dxa"/>
+            <w:bottom w:w="60" w:type="dxa"/>
+            <w:right w:w="0" w:type="dxa"/>
+          </w:tcMar>
+          <w:vAlign w:val="bottom"/>
+        </w:tcPr>
+        <w:p>
+          <w:pPr>
+            <w:spacing w:before="0" w:after="80"/>
+            <w:rPr>
+              <w:rFonts w:ascii="Open Sans" w:eastAsia="Open Sans" w:hAnsi="Open Sans" w:cs="Open Sans"/>
+              <w:b/>
+              <w:bCs/>
+              <w:color w:val="1F2D3D"/>
+              <w:sz w:val="28"/>
+              <w:szCs w:val="28"/>
+              <w:spacing w:val="100"/>
+            </w:rPr>
+          </w:pPr>
+          <w:r>
+            <w:rPr>
+              <w:rFonts w:ascii="Open Sans" w:eastAsia="Open Sans" w:hAnsi="Open Sans" w:cs="Open Sans"/>
+              <w:b/>
+              <w:bCs/>
+              <w:color w:val="1F2D3D"/>
+              <w:sz w:val="28"/>
+              <w:szCs w:val="28"/>
+              <w:spacing w:val="100"/>
+            </w:rPr>
+            <w:t xml:space="preserve">EmC2  Alltagshilfe</w:t>
+          </w:r>
+        </w:p>
+      </w:tc>
+      <w:tc>
+        <w:tcPr>
+          <w:tcW w:w="2160" w:type="dxa"/>
+          <w:tcBorders>
+            <w:top w:val="none"/>
+            <w:left w:val="none"/>
+            <w:bottom w:val="single" w:sz="12" w:space="0" w:color="2E74B5"/>
+            <w:right w:val="none"/>
+          </w:tcBorders>
+          <w:tcMar>
+            <w:top w:w="0" w:type="dxa"/>
+            <w:left w:w="0" w:type="dxa"/>
+            <w:bottom w:w="0" w:type="dxa"/>
+            <w:right w:w="0" w:type="dxa"/>
+          </w:tcMar>
+          <w:vAlign w:val="bottom"/>
+        </w:tcPr>
+        <w:p>
+          <w:pPr>
+            <w:jc w:val="right"/>
+            <w:spacing w:before="0" w:after="0"/>
+          </w:pPr>
+          <w:r>
+            <w:rPr>
+              <w:noProof/>
+            </w:rPr>
+            <w:drawing>
+              <wp:inline xmlns:wp="http://schemas.openxmlformats.org/drawingml/2006/wordprocessingDrawing" distT="0" distB="0" distL="0" distR="0">
+                <wp:extent cx="1585595" cy="920750"/>
+                <wp:effectExtent l="0" t="0" r="0" b="0"/>
+                <wp:docPr id="2" name="emc2-logo.jpg"/>
+                <wp:cNvGraphicFramePr/>
+                <a:graphic xmlns:a="http://schemas.openxmlformats.org/drawingml/2006/main">
+                  <a:graphicData uri="http://schemas.openxmlformats.org/drawingml/2006/picture">
+                    <pic:pic xmlns:pic="http://schemas.openxmlformats.org/drawingml/2006/picture">
+                      <pic:nvPicPr>
+                        <pic:cNvPr id="0" name=""/>
+                        <pic:cNvPicPr>
+                          <a:picLocks noChangeAspect="1" noChangeArrowheads="1"/>
+                        </pic:cNvPicPr>
+                      </pic:nvPicPr>
+                      <pic:blipFill>
+                        <a:blip r:embed="rId1"/>
+                        <a:stretch>
+                          <a:fillRect/>
+                        </a:stretch>
+                      </pic:blipFill>
+                      <pic:spPr bwMode="auto">
+                        <a:xfrm>
+                          <a:off x="0" y="0"/>
+                          <a:ext cx="1585595" cy="920750"/>
+                        </a:xfrm>
+                        <a:prstGeom prst="rect">
+                          <a:avLst/>
+                        </a:prstGeom>
+                      </pic:spPr>
+                    </pic:pic>
+                  </a:graphicData>
+                </a:graphic>
+              </wp:inline>
+            </w:drawing>
+          </w:r>
+        </w:p>
+      </w:tc>
+    </w:tr>
+  </w:tbl>
 </w:hdr>
 </file>
 

</xml_diff>

<commit_message>
fix(ah): logo sits on blue line — remove border from logo cell
Blue bottom border is now only on the title cell (left), not the logo cell.
Logo is top-aligned in its cell so it extends down past the line level,
matching the original design where the emc² symbol overlaps the separator.

Co-Authored-By: Claude Sonnet 4.6 (1M context) <noreply@anthropic.com>
</commit_message>
<xml_diff>
--- a/src/templates/Angebot-AH.docx
+++ b/src/templates/Angebot-AH.docx
@@ -2569,7 +2569,7 @@
           <w:tcBorders>
             <w:top w:val="none"/>
             <w:left w:val="none"/>
-            <w:bottom w:val="single" w:sz="12" w:space="0" w:color="2E74B5"/>
+            <w:bottom w:val="none"/>
             <w:right w:val="none"/>
           </w:tcBorders>
           <w:tcMar>
@@ -2578,7 +2578,7 @@
             <w:bottom w:w="0" w:type="dxa"/>
             <w:right w:w="0" w:type="dxa"/>
           </w:tcMar>
-          <w:vAlign w:val="bottom"/>
+          <w:vAlign w:val="top"/>
         </w:tcPr>
         <w:p>
           <w:pPr>
@@ -2706,7 +2706,7 @@
           <w:tcBorders>
             <w:top w:val="none"/>
             <w:left w:val="none"/>
-            <w:bottom w:val="single" w:sz="12" w:space="0" w:color="2E74B5"/>
+            <w:bottom w:val="none"/>
             <w:right w:val="none"/>
           </w:tcBorders>
           <w:tcMar>
@@ -2715,7 +2715,7 @@
             <w:bottom w:w="0" w:type="dxa"/>
             <w:right w:w="0" w:type="dxa"/>
           </w:tcMar>
-          <w:vAlign w:val="bottom"/>
+          <w:vAlign w:val="top"/>
         </w:tcPr>
         <w:p>
           <w:pPr>

</xml_diff>

<commit_message>
fix(ah): logo straddles blue line via 2-row vertical merge
Replace single-row table with 2-row vMerge structure:
- Row 1 (725 dxa): title text bottom-aligned | logo top-half (vMerge start)
- Row 2 (725 dxa): blue line as TOP border   | logo bottom-half (vMerge continue)

The logo image spans both rows (total = full logo height ~1450 dxa),
so the blue separator line (2.25pt, #2E74B5) crosses exactly through
the vertical midpoint of the emc² logo — matching the original AH design.

Co-Authored-By: Claude Sonnet 4.6 (1M context) <noreply@anthropic.com>
</commit_message>
<xml_diff>
--- a/src/templates/Angebot-AH.docx
+++ b/src/templates/Angebot-AH.docx
@@ -2518,27 +2518,29 @@
       <w:gridCol w:w="2160"/>
     </w:tblGrid>
     <w:tr>
-      <w:trPr/>
+      <w:trPr>
+        <w:trHeight w:val="725" w:hRule="exact"/>
+      </w:trPr>
       <w:tc>
         <w:tcPr>
           <w:tcW w:w="7200" w:type="dxa"/>
           <w:tcBorders>
-            <w:top w:val="none"/>
-            <w:left w:val="none"/>
-            <w:bottom w:val="single" w:sz="12" w:space="0" w:color="2E74B5"/>
-            <w:right w:val="none"/>
+            <w:top w:val="none" w:sz="0" w:space="0" w:color="auto"/>
+            <w:left w:val="none" w:sz="0" w:space="0" w:color="auto"/>
+            <w:bottom w:val="none" w:sz="0" w:space="0" w:color="auto"/>
+            <w:right w:val="none" w:sz="0" w:space="0" w:color="auto"/>
           </w:tcBorders>
           <w:tcMar>
             <w:top w:w="0" w:type="dxa"/>
             <w:left w:w="0" w:type="dxa"/>
-            <w:bottom w:w="60" w:type="dxa"/>
+            <w:bottom w:w="0" w:type="dxa"/>
             <w:right w:w="0" w:type="dxa"/>
           </w:tcMar>
           <w:vAlign w:val="bottom"/>
         </w:tcPr>
         <w:p>
           <w:pPr>
-            <w:spacing w:before="0" w:after="80"/>
+            <w:spacing w:before="0" w:after="60"/>
             <w:rPr>
               <w:rFonts w:ascii="Open Sans" w:eastAsia="Open Sans" w:hAnsi="Open Sans" w:cs="Open Sans"/>
               <w:b/>
@@ -2566,11 +2568,12 @@
       <w:tc>
         <w:tcPr>
           <w:tcW w:w="2160" w:type="dxa"/>
+          <w:vMerge w:val="restart"/>
           <w:tcBorders>
-            <w:top w:val="none"/>
-            <w:left w:val="none"/>
-            <w:bottom w:val="none"/>
-            <w:right w:val="none"/>
+            <w:top w:val="none" w:sz="0" w:space="0" w:color="auto"/>
+            <w:left w:val="none" w:sz="0" w:space="0" w:color="auto"/>
+            <w:bottom w:val="none" w:sz="0" w:space="0" w:color="auto"/>
+            <w:right w:val="none" w:sz="0" w:space="0" w:color="auto"/>
           </w:tcBorders>
           <w:tcMar>
             <w:top w:w="0" w:type="dxa"/>
@@ -2628,6 +2631,56 @@
         </w:p>
       </w:tc>
     </w:tr>
+    <w:tr>
+      <w:trPr>
+        <w:trHeight w:val="725" w:hRule="exact"/>
+      </w:trPr>
+      <w:tc>
+        <w:tcPr>
+          <w:tcW w:w="7200" w:type="dxa"/>
+          <w:tcBorders>
+            <w:top w:val="single" w:sz="18" w:space="0" w:color="2E74B5"/>
+            <w:left w:val="none" w:sz="0" w:space="0" w:color="auto"/>
+            <w:bottom w:val="none" w:sz="0" w:space="0" w:color="auto"/>
+            <w:right w:val="none" w:sz="0" w:space="0" w:color="auto"/>
+          </w:tcBorders>
+          <w:tcMar>
+            <w:top w:w="0" w:type="dxa"/>
+            <w:left w:w="0" w:type="dxa"/>
+            <w:bottom w:w="0" w:type="dxa"/>
+            <w:right w:w="0" w:type="dxa"/>
+          </w:tcMar>
+        </w:tcPr>
+        <w:p>
+          <w:pPr>
+            <w:spacing w:before="0" w:after="0"/>
+          </w:pPr>
+        </w:p>
+      </w:tc>
+      <w:tc>
+        <w:tcPr>
+          <w:tcW w:w="2160" w:type="dxa"/>
+          <w:vMerge/>
+          <w:tcBorders>
+            <w:top w:val="none" w:sz="0" w:space="0" w:color="auto"/>
+            <w:left w:val="none" w:sz="0" w:space="0" w:color="auto"/>
+            <w:bottom w:val="none" w:sz="0" w:space="0" w:color="auto"/>
+            <w:right w:val="none" w:sz="0" w:space="0" w:color="auto"/>
+          </w:tcBorders>
+          <w:tcMar>
+            <w:top w:w="0" w:type="dxa"/>
+            <w:left w:w="0" w:type="dxa"/>
+            <w:bottom w:w="0" w:type="dxa"/>
+            <w:right w:w="0" w:type="dxa"/>
+          </w:tcMar>
+        </w:tcPr>
+        <w:p>
+          <w:pPr>
+            <w:spacing w:before="0" w:after="0"/>
+          </w:pPr>
+        </w:p>
+      </w:tc>
+    </w:tr>
   </w:tbl>
 </w:hdr>
 </file>
@@ -2655,27 +2708,29 @@
       <w:gridCol w:w="2160"/>
     </w:tblGrid>
     <w:tr>
-      <w:trPr/>
+      <w:trPr>
+        <w:trHeight w:val="725" w:hRule="exact"/>
+      </w:trPr>
       <w:tc>
         <w:tcPr>
           <w:tcW w:w="7200" w:type="dxa"/>
           <w:tcBorders>
-            <w:top w:val="none"/>
-            <w:left w:val="none"/>
-            <w:bottom w:val="single" w:sz="12" w:space="0" w:color="2E74B5"/>
-            <w:right w:val="none"/>
+            <w:top w:val="none" w:sz="0" w:space="0" w:color="auto"/>
+            <w:left w:val="none" w:sz="0" w:space="0" w:color="auto"/>
+            <w:bottom w:val="none" w:sz="0" w:space="0" w:color="auto"/>
+            <w:right w:val="none" w:sz="0" w:space="0" w:color="auto"/>
           </w:tcBorders>
           <w:tcMar>
             <w:top w:w="0" w:type="dxa"/>
             <w:left w:w="0" w:type="dxa"/>
-            <w:bottom w:w="60" w:type="dxa"/>
+            <w:bottom w:w="0" w:type="dxa"/>
             <w:right w:w="0" w:type="dxa"/>
           </w:tcMar>
           <w:vAlign w:val="bottom"/>
         </w:tcPr>
         <w:p>
           <w:pPr>
-            <w:spacing w:before="0" w:after="80"/>
+            <w:spacing w:before="0" w:after="60"/>
             <w:rPr>
               <w:rFonts w:ascii="Open Sans" w:eastAsia="Open Sans" w:hAnsi="Open Sans" w:cs="Open Sans"/>
               <w:b/>
@@ -2703,11 +2758,12 @@
       <w:tc>
         <w:tcPr>
           <w:tcW w:w="2160" w:type="dxa"/>
+          <w:vMerge w:val="restart"/>
           <w:tcBorders>
-            <w:top w:val="none"/>
-            <w:left w:val="none"/>
-            <w:bottom w:val="none"/>
-            <w:right w:val="none"/>
+            <w:top w:val="none" w:sz="0" w:space="0" w:color="auto"/>
+            <w:left w:val="none" w:sz="0" w:space="0" w:color="auto"/>
+            <w:bottom w:val="none" w:sz="0" w:space="0" w:color="auto"/>
+            <w:right w:val="none" w:sz="0" w:space="0" w:color="auto"/>
           </w:tcBorders>
           <w:tcMar>
             <w:top w:w="0" w:type="dxa"/>
@@ -2762,6 +2818,56 @@
               </wp:inline>
             </w:drawing>
           </w:r>
+        </w:p>
+      </w:tc>
+    </w:tr>
+    <w:tr>
+      <w:trPr>
+        <w:trHeight w:val="725" w:hRule="exact"/>
+      </w:trPr>
+      <w:tc>
+        <w:tcPr>
+          <w:tcW w:w="7200" w:type="dxa"/>
+          <w:tcBorders>
+            <w:top w:val="single" w:sz="18" w:space="0" w:color="2E74B5"/>
+            <w:left w:val="none" w:sz="0" w:space="0" w:color="auto"/>
+            <w:bottom w:val="none" w:sz="0" w:space="0" w:color="auto"/>
+            <w:right w:val="none" w:sz="0" w:space="0" w:color="auto"/>
+          </w:tcBorders>
+          <w:tcMar>
+            <w:top w:w="0" w:type="dxa"/>
+            <w:left w:w="0" w:type="dxa"/>
+            <w:bottom w:w="0" w:type="dxa"/>
+            <w:right w:w="0" w:type="dxa"/>
+          </w:tcMar>
+        </w:tcPr>
+        <w:p>
+          <w:pPr>
+            <w:spacing w:before="0" w:after="0"/>
+          </w:pPr>
+        </w:p>
+      </w:tc>
+      <w:tc>
+        <w:tcPr>
+          <w:tcW w:w="2160" w:type="dxa"/>
+          <w:vMerge/>
+          <w:tcBorders>
+            <w:top w:val="none" w:sz="0" w:space="0" w:color="auto"/>
+            <w:left w:val="none" w:sz="0" w:space="0" w:color="auto"/>
+            <w:bottom w:val="none" w:sz="0" w:space="0" w:color="auto"/>
+            <w:right w:val="none" w:sz="0" w:space="0" w:color="auto"/>
+          </w:tcBorders>
+          <w:tcMar>
+            <w:top w:w="0" w:type="dxa"/>
+            <w:left w:w="0" w:type="dxa"/>
+            <w:bottom w:w="0" w:type="dxa"/>
+            <w:right w:w="0" w:type="dxa"/>
+          </w:tcMar>
+        </w:tcPr>
+        <w:p>
+          <w:pPr>
+            <w:spacing w:before="0" w:after="0"/>
+          </w:pPr>
         </w:p>
       </w:tc>
     </w:tr>

</xml_diff>

<commit_message>
fix(ah): extend blue line through logo cell to full width
Add blue top border to the vMerge continuation cell (row2LogoCell)
so the separator line runs continuously from the left margin all the
way through the logo area — matching the original full-width design.

Co-Authored-By: Claude Sonnet 4.6 (1M context) <noreply@anthropic.com>
</commit_message>
<xml_diff>
--- a/src/templates/Angebot-AH.docx
+++ b/src/templates/Angebot-AH.docx
@@ -2662,7 +2662,7 @@
           <w:tcW w:w="2160" w:type="dxa"/>
           <w:vMerge/>
           <w:tcBorders>
-            <w:top w:val="none" w:sz="0" w:space="0" w:color="auto"/>
+            <w:top w:val="single" w:sz="18" w:space="0" w:color="2E74B5"/>
             <w:left w:val="none" w:sz="0" w:space="0" w:color="auto"/>
             <w:bottom w:val="none" w:sz="0" w:space="0" w:color="auto"/>
             <w:right w:val="none" w:sz="0" w:space="0" w:color="auto"/>
@@ -2852,7 +2852,7 @@
           <w:tcW w:w="2160" w:type="dxa"/>
           <w:vMerge/>
           <w:tcBorders>
-            <w:top w:val="none" w:sz="0" w:space="0" w:color="auto"/>
+            <w:top w:val="single" w:sz="18" w:space="0" w:color="2E74B5"/>
             <w:left w:val="none" w:sz="0" w:space="0" w:color="auto"/>
             <w:bottom w:val="none" w:sz="0" w:space="0" w:color="auto"/>
             <w:right w:val="none" w:sz="0" w:space="0" w:color="auto"/>

</xml_diff>

<commit_message>
fix(ah): floating anchor logo + full-width paragraph border for header
Replace vMerge table approach (borders suppressed by Word on merged cells)
with a cleaner design:
- Blue line: <w:pBdr><w:bottom/> on the title paragraph — spans the FULL
  header width by nature, no cell border tricks needed
- Logo: <wp:anchor> floating in-front-of-text, right-aligned to margin,
  vertical posOffset=-205000 EMU so the logo centre aligns with the
  paragraph's bottom border (the blue line)

Works in all OOXML renderers (Word, LibreOffice, Syncfusion) without any
manual "Wrap Text" editing.

Co-Authored-By: Claude Sonnet 4.6 (1M context) <noreply@anthropic.com>
</commit_message>
<xml_diff>
--- a/src/templates/Angebot-AH.docx
+++ b/src/templates/Angebot-AH.docx
@@ -2502,186 +2502,85 @@
       <w:pStyle w:val="normal1"/>
     </w:pPr>
   </w:p>
-  <w:tbl>
-    <w:tblPr>
-      <w:tblStyle w:val="NormalTable0"/>
-      <w:tblW w:w="9360" w:type="dxa"/>
-      <w:tblInd w:w="0" w:type="dxa"/>
-      <w:tblLayout w:type="fixed"/>
-      <w:tblCellMar>
-        <w:left w:w="0" w:type="dxa"/>
-        <w:right w:w="0" w:type="dxa"/>
-      </w:tblCellMar>
-    </w:tblPr>
-    <w:tblGrid>
-      <w:gridCol w:w="7200"/>
-      <w:gridCol w:w="2160"/>
-    </w:tblGrid>
-    <w:tr>
-      <w:trPr>
-        <w:trHeight w:val="725" w:hRule="exact"/>
-      </w:trPr>
-      <w:tc>
-        <w:tcPr>
-          <w:tcW w:w="7200" w:type="dxa"/>
-          <w:tcBorders>
-            <w:top w:val="none" w:sz="0" w:space="0" w:color="auto"/>
-            <w:left w:val="none" w:sz="0" w:space="0" w:color="auto"/>
-            <w:bottom w:val="none" w:sz="0" w:space="0" w:color="auto"/>
-            <w:right w:val="none" w:sz="0" w:space="0" w:color="auto"/>
-          </w:tcBorders>
-          <w:tcMar>
-            <w:top w:w="0" w:type="dxa"/>
-            <w:left w:w="0" w:type="dxa"/>
-            <w:bottom w:w="0" w:type="dxa"/>
-            <w:right w:w="0" w:type="dxa"/>
-          </w:tcMar>
-          <w:vAlign w:val="bottom"/>
-        </w:tcPr>
-        <w:p>
-          <w:pPr>
-            <w:spacing w:before="0" w:after="60"/>
-            <w:rPr>
-              <w:rFonts w:ascii="Open Sans" w:eastAsia="Open Sans" w:hAnsi="Open Sans" w:cs="Open Sans"/>
-              <w:b/>
-              <w:bCs/>
-              <w:color w:val="1F2D3D"/>
-              <w:sz w:val="28"/>
-              <w:szCs w:val="28"/>
-              <w:spacing w:val="100"/>
-            </w:rPr>
-          </w:pPr>
-          <w:r>
-            <w:rPr>
-              <w:rFonts w:ascii="Open Sans" w:eastAsia="Open Sans" w:hAnsi="Open Sans" w:cs="Open Sans"/>
-              <w:b/>
-              <w:bCs/>
-              <w:color w:val="1F2D3D"/>
-              <w:sz w:val="28"/>
-              <w:szCs w:val="28"/>
-              <w:spacing w:val="100"/>
-            </w:rPr>
-            <w:t xml:space="preserve">EmC2  Alltagshilfe</w:t>
-          </w:r>
-        </w:p>
-      </w:tc>
-      <w:tc>
-        <w:tcPr>
-          <w:tcW w:w="2160" w:type="dxa"/>
-          <w:vMerge w:val="restart"/>
-          <w:tcBorders>
-            <w:top w:val="none" w:sz="0" w:space="0" w:color="auto"/>
-            <w:left w:val="none" w:sz="0" w:space="0" w:color="auto"/>
-            <w:bottom w:val="none" w:sz="0" w:space="0" w:color="auto"/>
-            <w:right w:val="none" w:sz="0" w:space="0" w:color="auto"/>
-          </w:tcBorders>
-          <w:tcMar>
-            <w:top w:w="0" w:type="dxa"/>
-            <w:left w:w="0" w:type="dxa"/>
-            <w:bottom w:w="0" w:type="dxa"/>
-            <w:right w:w="0" w:type="dxa"/>
-          </w:tcMar>
-          <w:vAlign w:val="top"/>
-        </w:tcPr>
-        <w:p>
-          <w:pPr>
-            <w:jc w:val="right"/>
-            <w:spacing w:before="0" w:after="0"/>
-          </w:pPr>
-          <w:r>
-            <w:rPr>
-              <w:noProof/>
-            </w:rPr>
-            <w:drawing>
-              <wp:inline xmlns:wp="http://schemas.openxmlformats.org/drawingml/2006/wordprocessingDrawing" distT="0" distB="0" distL="0" distR="0">
-                <wp:extent cx="1585595" cy="920750"/>
-                <wp:effectExtent l="0" t="0" r="0" b="0"/>
-                <wp:docPr id="2" name="emc2-logo.jpg"/>
-                <wp:cNvGraphicFramePr/>
-                <a:graphic xmlns:a="http://schemas.openxmlformats.org/drawingml/2006/main">
-                  <a:graphicData uri="http://schemas.openxmlformats.org/drawingml/2006/picture">
-                    <pic:pic xmlns:pic="http://schemas.openxmlformats.org/drawingml/2006/picture">
-                      <pic:nvPicPr>
-                        <pic:cNvPr id="0" name=""/>
-                        <pic:cNvPicPr>
-                          <a:picLocks noChangeAspect="1" noChangeArrowheads="1"/>
-                        </pic:cNvPicPr>
-                      </pic:nvPicPr>
-                      <pic:blipFill>
-                        <a:blip r:embed="rId1"/>
-                        <a:stretch>
-                          <a:fillRect/>
-                        </a:stretch>
-                      </pic:blipFill>
-                      <pic:spPr bwMode="auto">
-                        <a:xfrm>
-                          <a:off x="0" y="0"/>
-                          <a:ext cx="1585595" cy="920750"/>
-                        </a:xfrm>
-                        <a:prstGeom prst="rect">
-                          <a:avLst/>
-                        </a:prstGeom>
-                      </pic:spPr>
-                    </pic:pic>
-                  </a:graphicData>
-                </a:graphic>
-              </wp:inline>
-            </w:drawing>
-          </w:r>
-        </w:p>
-      </w:tc>
-    </w:tr>
-    <w:tr>
-      <w:trPr>
-        <w:trHeight w:val="725" w:hRule="exact"/>
-      </w:trPr>
-      <w:tc>
-        <w:tcPr>
-          <w:tcW w:w="7200" w:type="dxa"/>
-          <w:tcBorders>
-            <w:top w:val="single" w:sz="18" w:space="0" w:color="2E74B5"/>
-            <w:left w:val="none" w:sz="0" w:space="0" w:color="auto"/>
-            <w:bottom w:val="none" w:sz="0" w:space="0" w:color="auto"/>
-            <w:right w:val="none" w:sz="0" w:space="0" w:color="auto"/>
-          </w:tcBorders>
-          <w:tcMar>
-            <w:top w:w="0" w:type="dxa"/>
-            <w:left w:w="0" w:type="dxa"/>
-            <w:bottom w:w="0" w:type="dxa"/>
-            <w:right w:w="0" w:type="dxa"/>
-          </w:tcMar>
-        </w:tcPr>
-        <w:p>
-          <w:pPr>
-            <w:spacing w:before="0" w:after="0"/>
-          </w:pPr>
-        </w:p>
-      </w:tc>
-      <w:tc>
-        <w:tcPr>
-          <w:tcW w:w="2160" w:type="dxa"/>
-          <w:vMerge/>
-          <w:tcBorders>
-            <w:top w:val="single" w:sz="18" w:space="0" w:color="2E74B5"/>
-            <w:left w:val="none" w:sz="0" w:space="0" w:color="auto"/>
-            <w:bottom w:val="none" w:sz="0" w:space="0" w:color="auto"/>
-            <w:right w:val="none" w:sz="0" w:space="0" w:color="auto"/>
-          </w:tcBorders>
-          <w:tcMar>
-            <w:top w:w="0" w:type="dxa"/>
-            <w:left w:w="0" w:type="dxa"/>
-            <w:bottom w:w="0" w:type="dxa"/>
-            <w:right w:w="0" w:type="dxa"/>
-          </w:tcMar>
-        </w:tcPr>
-        <w:p>
-          <w:pPr>
-            <w:spacing w:before="0" w:after="0"/>
-          </w:pPr>
-        </w:p>
-      </w:tc>
-    </w:tr>
-  </w:tbl>
+  <w:p>
+    <w:pPr>
+      <w:spacing w:before="0" w:after="80"/>
+      <w:pBdr>
+        <w:bottom w:val="single" w:sz="18" w:space="0" w:color="2E74B5"/>
+      </w:pBdr>
+      <w:rPr>
+        <w:rFonts w:ascii="Open Sans" w:eastAsia="Open Sans" w:hAnsi="Open Sans" w:cs="Open Sans"/>
+        <w:b/>
+        <w:bCs/>
+        <w:color w:val="1F2D3D"/>
+        <w:sz w:val="28"/>
+        <w:szCs w:val="28"/>
+        <w:spacing w:val="100"/>
+      </w:rPr>
+    </w:pPr>
+    <w:r>
+      <w:rPr>
+        <w:rFonts w:ascii="Open Sans" w:eastAsia="Open Sans" w:hAnsi="Open Sans" w:cs="Open Sans"/>
+        <w:b/>
+        <w:bCs/>
+        <w:color w:val="1F2D3D"/>
+        <w:sz w:val="28"/>
+        <w:szCs w:val="28"/>
+        <w:spacing w:val="100"/>
+      </w:rPr>
+      <w:t xml:space="preserve">EmC2  Alltagshilfe</w:t>
+    </w:r>
+    <w:r>
+      <w:rPr>
+        <w:noProof/>
+      </w:rPr>
+      <w:drawing>
+        <wp:anchor distT="0" distB="0" distL="114300" distR="114300" simplePos="0" relativeHeight="251658240" behindDoc="0" locked="0" layoutInCell="0" allowOverlap="1">
+          <wp:simplePos x="0" y="0"/>
+          <wp:positionH relativeFrom="margin">
+            <wp:align>right</wp:align>
+          </wp:positionH>
+          <wp:positionV relativeFrom="paragraph">
+            <wp:posOffset>-205000</wp:posOffset>
+          </wp:positionV>
+          <wp:extent cx="1585595" cy="920750"/>
+          <wp:effectExtent l="0" t="0" r="0" b="0"/>
+          <wp:wrapNone/>
+          <wp:docPr id="2" name="emc2-logo"/>
+          <wp:cNvGraphicFramePr>
+            <a:graphicFrameLocks xmlns:a="http://schemas.openxmlformats.org/drawingml/2006/main" noChangeAspect="1"/>
+          </wp:cNvGraphicFramePr>
+          <a:graphic xmlns:a="http://schemas.openxmlformats.org/drawingml/2006/main">
+            <a:graphicData uri="http://schemas.openxmlformats.org/drawingml/2006/picture">
+              <pic:pic xmlns:pic="http://schemas.openxmlformats.org/drawingml/2006/picture">
+                <pic:nvPicPr>
+                  <pic:cNvPr id="0" name=""/>
+                  <pic:cNvPicPr>
+                    <a:picLocks noChangeAspect="1" noChangeArrowheads="1"/>
+                  </pic:cNvPicPr>
+                </pic:nvPicPr>
+                <pic:blipFill>
+                  <a:blip r:embed="rId1"/>
+                  <a:stretch>
+                    <a:fillRect/>
+                  </a:stretch>
+                </pic:blipFill>
+                <pic:spPr bwMode="auto">
+                  <a:xfrm>
+                    <a:off x="0" y="0"/>
+                    <a:ext cx="1585595" cy="920750"/>
+                  </a:xfrm>
+                  <a:prstGeom prst="rect">
+                    <a:avLst/>
+                  </a:prstGeom>
+                </pic:spPr>
+              </pic:pic>
+            </a:graphicData>
+          </a:graphic>
+        </wp:anchor>
+      </w:drawing>
+    </w:r>
+  </w:p>
 </w:hdr>
 </file>
 
@@ -2692,186 +2591,85 @@
       <w:pStyle w:val="normal1"/>
     </w:pPr>
   </w:p>
-  <w:tbl>
-    <w:tblPr>
-      <w:tblStyle w:val="NormalTable0"/>
-      <w:tblW w:w="9360" w:type="dxa"/>
-      <w:tblInd w:w="0" w:type="dxa"/>
-      <w:tblLayout w:type="fixed"/>
-      <w:tblCellMar>
-        <w:left w:w="0" w:type="dxa"/>
-        <w:right w:w="0" w:type="dxa"/>
-      </w:tblCellMar>
-    </w:tblPr>
-    <w:tblGrid>
-      <w:gridCol w:w="7200"/>
-      <w:gridCol w:w="2160"/>
-    </w:tblGrid>
-    <w:tr>
-      <w:trPr>
-        <w:trHeight w:val="725" w:hRule="exact"/>
-      </w:trPr>
-      <w:tc>
-        <w:tcPr>
-          <w:tcW w:w="7200" w:type="dxa"/>
-          <w:tcBorders>
-            <w:top w:val="none" w:sz="0" w:space="0" w:color="auto"/>
-            <w:left w:val="none" w:sz="0" w:space="0" w:color="auto"/>
-            <w:bottom w:val="none" w:sz="0" w:space="0" w:color="auto"/>
-            <w:right w:val="none" w:sz="0" w:space="0" w:color="auto"/>
-          </w:tcBorders>
-          <w:tcMar>
-            <w:top w:w="0" w:type="dxa"/>
-            <w:left w:w="0" w:type="dxa"/>
-            <w:bottom w:w="0" w:type="dxa"/>
-            <w:right w:w="0" w:type="dxa"/>
-          </w:tcMar>
-          <w:vAlign w:val="bottom"/>
-        </w:tcPr>
-        <w:p>
-          <w:pPr>
-            <w:spacing w:before="0" w:after="60"/>
-            <w:rPr>
-              <w:rFonts w:ascii="Open Sans" w:eastAsia="Open Sans" w:hAnsi="Open Sans" w:cs="Open Sans"/>
-              <w:b/>
-              <w:bCs/>
-              <w:color w:val="1F2D3D"/>
-              <w:sz w:val="28"/>
-              <w:szCs w:val="28"/>
-              <w:spacing w:val="100"/>
-            </w:rPr>
-          </w:pPr>
-          <w:r>
-            <w:rPr>
-              <w:rFonts w:ascii="Open Sans" w:eastAsia="Open Sans" w:hAnsi="Open Sans" w:cs="Open Sans"/>
-              <w:b/>
-              <w:bCs/>
-              <w:color w:val="1F2D3D"/>
-              <w:sz w:val="28"/>
-              <w:szCs w:val="28"/>
-              <w:spacing w:val="100"/>
-            </w:rPr>
-            <w:t xml:space="preserve">EmC2  Alltagshilfe</w:t>
-          </w:r>
-        </w:p>
-      </w:tc>
-      <w:tc>
-        <w:tcPr>
-          <w:tcW w:w="2160" w:type="dxa"/>
-          <w:vMerge w:val="restart"/>
-          <w:tcBorders>
-            <w:top w:val="none" w:sz="0" w:space="0" w:color="auto"/>
-            <w:left w:val="none" w:sz="0" w:space="0" w:color="auto"/>
-            <w:bottom w:val="none" w:sz="0" w:space="0" w:color="auto"/>
-            <w:right w:val="none" w:sz="0" w:space="0" w:color="auto"/>
-          </w:tcBorders>
-          <w:tcMar>
-            <w:top w:w="0" w:type="dxa"/>
-            <w:left w:w="0" w:type="dxa"/>
-            <w:bottom w:w="0" w:type="dxa"/>
-            <w:right w:w="0" w:type="dxa"/>
-          </w:tcMar>
-          <w:vAlign w:val="top"/>
-        </w:tcPr>
-        <w:p>
-          <w:pPr>
-            <w:jc w:val="right"/>
-            <w:spacing w:before="0" w:after="0"/>
-          </w:pPr>
-          <w:r>
-            <w:rPr>
-              <w:noProof/>
-            </w:rPr>
-            <w:drawing>
-              <wp:inline xmlns:wp="http://schemas.openxmlformats.org/drawingml/2006/wordprocessingDrawing" distT="0" distB="0" distL="0" distR="0">
-                <wp:extent cx="1585595" cy="920750"/>
-                <wp:effectExtent l="0" t="0" r="0" b="0"/>
-                <wp:docPr id="2" name="emc2-logo.jpg"/>
-                <wp:cNvGraphicFramePr/>
-                <a:graphic xmlns:a="http://schemas.openxmlformats.org/drawingml/2006/main">
-                  <a:graphicData uri="http://schemas.openxmlformats.org/drawingml/2006/picture">
-                    <pic:pic xmlns:pic="http://schemas.openxmlformats.org/drawingml/2006/picture">
-                      <pic:nvPicPr>
-                        <pic:cNvPr id="0" name=""/>
-                        <pic:cNvPicPr>
-                          <a:picLocks noChangeAspect="1" noChangeArrowheads="1"/>
-                        </pic:cNvPicPr>
-                      </pic:nvPicPr>
-                      <pic:blipFill>
-                        <a:blip r:embed="rId1"/>
-                        <a:stretch>
-                          <a:fillRect/>
-                        </a:stretch>
-                      </pic:blipFill>
-                      <pic:spPr bwMode="auto">
-                        <a:xfrm>
-                          <a:off x="0" y="0"/>
-                          <a:ext cx="1585595" cy="920750"/>
-                        </a:xfrm>
-                        <a:prstGeom prst="rect">
-                          <a:avLst/>
-                        </a:prstGeom>
-                      </pic:spPr>
-                    </pic:pic>
-                  </a:graphicData>
-                </a:graphic>
-              </wp:inline>
-            </w:drawing>
-          </w:r>
-        </w:p>
-      </w:tc>
-    </w:tr>
-    <w:tr>
-      <w:trPr>
-        <w:trHeight w:val="725" w:hRule="exact"/>
-      </w:trPr>
-      <w:tc>
-        <w:tcPr>
-          <w:tcW w:w="7200" w:type="dxa"/>
-          <w:tcBorders>
-            <w:top w:val="single" w:sz="18" w:space="0" w:color="2E74B5"/>
-            <w:left w:val="none" w:sz="0" w:space="0" w:color="auto"/>
-            <w:bottom w:val="none" w:sz="0" w:space="0" w:color="auto"/>
-            <w:right w:val="none" w:sz="0" w:space="0" w:color="auto"/>
-          </w:tcBorders>
-          <w:tcMar>
-            <w:top w:w="0" w:type="dxa"/>
-            <w:left w:w="0" w:type="dxa"/>
-            <w:bottom w:w="0" w:type="dxa"/>
-            <w:right w:w="0" w:type="dxa"/>
-          </w:tcMar>
-        </w:tcPr>
-        <w:p>
-          <w:pPr>
-            <w:spacing w:before="0" w:after="0"/>
-          </w:pPr>
-        </w:p>
-      </w:tc>
-      <w:tc>
-        <w:tcPr>
-          <w:tcW w:w="2160" w:type="dxa"/>
-          <w:vMerge/>
-          <w:tcBorders>
-            <w:top w:val="single" w:sz="18" w:space="0" w:color="2E74B5"/>
-            <w:left w:val="none" w:sz="0" w:space="0" w:color="auto"/>
-            <w:bottom w:val="none" w:sz="0" w:space="0" w:color="auto"/>
-            <w:right w:val="none" w:sz="0" w:space="0" w:color="auto"/>
-          </w:tcBorders>
-          <w:tcMar>
-            <w:top w:w="0" w:type="dxa"/>
-            <w:left w:w="0" w:type="dxa"/>
-            <w:bottom w:w="0" w:type="dxa"/>
-            <w:right w:w="0" w:type="dxa"/>
-          </w:tcMar>
-        </w:tcPr>
-        <w:p>
-          <w:pPr>
-            <w:spacing w:before="0" w:after="0"/>
-          </w:pPr>
-        </w:p>
-      </w:tc>
-    </w:tr>
-  </w:tbl>
+  <w:p>
+    <w:pPr>
+      <w:spacing w:before="0" w:after="80"/>
+      <w:pBdr>
+        <w:bottom w:val="single" w:sz="18" w:space="0" w:color="2E74B5"/>
+      </w:pBdr>
+      <w:rPr>
+        <w:rFonts w:ascii="Open Sans" w:eastAsia="Open Sans" w:hAnsi="Open Sans" w:cs="Open Sans"/>
+        <w:b/>
+        <w:bCs/>
+        <w:color w:val="1F2D3D"/>
+        <w:sz w:val="28"/>
+        <w:szCs w:val="28"/>
+        <w:spacing w:val="100"/>
+      </w:rPr>
+    </w:pPr>
+    <w:r>
+      <w:rPr>
+        <w:rFonts w:ascii="Open Sans" w:eastAsia="Open Sans" w:hAnsi="Open Sans" w:cs="Open Sans"/>
+        <w:b/>
+        <w:bCs/>
+        <w:color w:val="1F2D3D"/>
+        <w:sz w:val="28"/>
+        <w:szCs w:val="28"/>
+        <w:spacing w:val="100"/>
+      </w:rPr>
+      <w:t xml:space="preserve">EmC2  Alltagshilfe</w:t>
+    </w:r>
+    <w:r>
+      <w:rPr>
+        <w:noProof/>
+      </w:rPr>
+      <w:drawing>
+        <wp:anchor distT="0" distB="0" distL="114300" distR="114300" simplePos="0" relativeHeight="251658240" behindDoc="0" locked="0" layoutInCell="0" allowOverlap="1">
+          <wp:simplePos x="0" y="0"/>
+          <wp:positionH relativeFrom="margin">
+            <wp:align>right</wp:align>
+          </wp:positionH>
+          <wp:positionV relativeFrom="paragraph">
+            <wp:posOffset>-205000</wp:posOffset>
+          </wp:positionV>
+          <wp:extent cx="1585595" cy="920750"/>
+          <wp:effectExtent l="0" t="0" r="0" b="0"/>
+          <wp:wrapNone/>
+          <wp:docPr id="2" name="emc2-logo"/>
+          <wp:cNvGraphicFramePr>
+            <a:graphicFrameLocks xmlns:a="http://schemas.openxmlformats.org/drawingml/2006/main" noChangeAspect="1"/>
+          </wp:cNvGraphicFramePr>
+          <a:graphic xmlns:a="http://schemas.openxmlformats.org/drawingml/2006/main">
+            <a:graphicData uri="http://schemas.openxmlformats.org/drawingml/2006/picture">
+              <pic:pic xmlns:pic="http://schemas.openxmlformats.org/drawingml/2006/picture">
+                <pic:nvPicPr>
+                  <pic:cNvPr id="0" name=""/>
+                  <pic:cNvPicPr>
+                    <a:picLocks noChangeAspect="1" noChangeArrowheads="1"/>
+                  </pic:cNvPicPr>
+                </pic:nvPicPr>
+                <pic:blipFill>
+                  <a:blip r:embed="rId1"/>
+                  <a:stretch>
+                    <a:fillRect/>
+                  </a:stretch>
+                </pic:blipFill>
+                <pic:spPr bwMode="auto">
+                  <a:xfrm>
+                    <a:off x="0" y="0"/>
+                    <a:ext cx="1585595" cy="920750"/>
+                  </a:xfrm>
+                  <a:prstGeom prst="rect">
+                    <a:avLst/>
+                  </a:prstGeom>
+                </pic:spPr>
+              </pic:pic>
+            </a:graphicData>
+          </a:graphic>
+        </wp:anchor>
+      </w:drawing>
+    </w:r>
+  </w:p>
 </w:hdr>
 </file>
 

</xml_diff>

<commit_message>
fix(ah): replace paragraph border with inline DrawingML rect for controllable header line width
LibreOffice (used for PDF preview) ignores OOXML table cell borders and
paragraph borders in headers, so LINE_W had no effect. Switching to a
wps:wsp inline filled rectangle renders reliably across engines and makes
LINE_W actually control where the blue line stops.

Co-Authored-By: Claude Sonnet 4.6 (1M context) <noreply@anthropic.com>
</commit_message>
<xml_diff>
--- a/src/templates/Angebot-AH.docx
+++ b/src/templates/Angebot-AH.docx
@@ -2504,10 +2504,7 @@
   </w:p>
   <w:p>
     <w:pPr>
-      <w:spacing w:before="0" w:after="80"/>
-      <w:pBdr>
-        <w:bottom w:val="single" w:sz="18" w:space="0" w:color="2E74B5"/>
-      </w:pBdr>
+      <w:spacing w:before="0" w:after="0"/>
       <w:rPr>
         <w:rFonts w:ascii="Open Sans" w:eastAsia="Open Sans" w:hAnsi="Open Sans" w:cs="Open Sans"/>
         <w:b/>
@@ -2581,6 +2578,51 @@
       </w:drawing>
     </w:r>
   </w:p>
+  <w:p>
+    <w:pPr>
+      <w:spacing w:before="0" w:after="80"/>
+    </w:pPr>
+    <w:r>
+      <w:rPr>
+        <w:noProof/>
+      </w:rPr>
+      <w:drawing>
+        <wp:inline distT="0" distB="0" distL="0" distR="0">
+          <wp:extent cx="4286250" cy="28575"/>
+          <wp:effectExtent l="0" t="0" r="0" b="0"/>
+          <wp:docPr id="3" name="blue-line"/>
+          <wp:cNvGraphicFramePr>
+            <a:graphicFrameLocks xmlns:a="http://schemas.openxmlformats.org/drawingml/2006/main" noChangeAspect="1"/>
+          </wp:cNvGraphicFramePr>
+          <a:graphic xmlns:a="http://schemas.openxmlformats.org/drawingml/2006/main">
+            <a:graphicData uri="http://schemas.microsoft.com/office/word/2010/wordprocessingShape">
+              <wps:wsp xmlns:wps="http://schemas.microsoft.com/office/word/2010/wordprocessingShape">
+                <wps:cNvSpPr>
+                  <a:spLocks noChangeArrowheads="1"/>
+                </wps:cNvSpPr>
+                <wps:spPr>
+                  <a:xfrm>
+                    <a:off x="0" y="0"/>
+                    <a:ext cx="4286250" cy="28575"/>
+                  </a:xfrm>
+                  <a:prstGeom prst="rect">
+                    <a:avLst/>
+                  </a:prstGeom>
+                  <a:solidFill>
+                    <a:srgbClr val="2E74B5"/>
+                  </a:solidFill>
+                  <a:ln>
+                    <a:noFill/>
+                  </a:ln>
+                </wps:spPr>
+                <wps:bodyPr lIns="0" rIns="0" tIns="0" bIns="0" anchor="t"/>
+              </wps:wsp>
+            </a:graphicData>
+          </a:graphic>
+        </wp:inline>
+      </w:drawing>
+    </w:r>
+  </w:p>
 </w:hdr>
 </file>
 
@@ -2593,10 +2635,7 @@
   </w:p>
   <w:p>
     <w:pPr>
-      <w:spacing w:before="0" w:after="80"/>
-      <w:pBdr>
-        <w:bottom w:val="single" w:sz="18" w:space="0" w:color="2E74B5"/>
-      </w:pBdr>
+      <w:spacing w:before="0" w:after="0"/>
       <w:rPr>
         <w:rFonts w:ascii="Open Sans" w:eastAsia="Open Sans" w:hAnsi="Open Sans" w:cs="Open Sans"/>
         <w:b/>
@@ -2667,6 +2706,51 @@
             </a:graphicData>
           </a:graphic>
         </wp:anchor>
+      </w:drawing>
+    </w:r>
+  </w:p>
+  <w:p>
+    <w:pPr>
+      <w:spacing w:before="0" w:after="80"/>
+    </w:pPr>
+    <w:r>
+      <w:rPr>
+        <w:noProof/>
+      </w:rPr>
+      <w:drawing>
+        <wp:inline distT="0" distB="0" distL="0" distR="0">
+          <wp:extent cx="4286250" cy="28575"/>
+          <wp:effectExtent l="0" t="0" r="0" b="0"/>
+          <wp:docPr id="3" name="blue-line"/>
+          <wp:cNvGraphicFramePr>
+            <a:graphicFrameLocks xmlns:a="http://schemas.openxmlformats.org/drawingml/2006/main" noChangeAspect="1"/>
+          </wp:cNvGraphicFramePr>
+          <a:graphic xmlns:a="http://schemas.openxmlformats.org/drawingml/2006/main">
+            <a:graphicData uri="http://schemas.microsoft.com/office/word/2010/wordprocessingShape">
+              <wps:wsp xmlns:wps="http://schemas.microsoft.com/office/word/2010/wordprocessingShape">
+                <wps:cNvSpPr>
+                  <a:spLocks noChangeArrowheads="1"/>
+                </wps:cNvSpPr>
+                <wps:spPr>
+                  <a:xfrm>
+                    <a:off x="0" y="0"/>
+                    <a:ext cx="4286250" cy="28575"/>
+                  </a:xfrm>
+                  <a:prstGeom prst="rect">
+                    <a:avLst/>
+                  </a:prstGeom>
+                  <a:solidFill>
+                    <a:srgbClr val="2E74B5"/>
+                  </a:solidFill>
+                  <a:ln>
+                    <a:noFill/>
+                  </a:ln>
+                </wps:spPr>
+                <wps:bodyPr lIns="0" rIns="0" tIns="0" bIns="0" anchor="t"/>
+              </wps:wsp>
+            </a:graphicData>
+          </a:graphic>
+        </wp:inline>
       </w:drawing>
     </w:r>
   </w:p>

</xml_diff>

<commit_message>
fix(ah-template): resize logo to 50% and rebuild blue header line
Co-Authored-By: Claude Sonnet 4.6 <noreply@anthropic.com>
</commit_message>
<xml_diff>
--- a/src/templates/Angebot-AH.docx
+++ b/src/templates/Angebot-AH.docx
@@ -2527,6 +2527,51 @@
       </w:rPr>
       <w:t xml:space="preserve">EmC2  Alltagshilfe</w:t>
     </w:r>
+  </w:p>
+  <w:p>
+    <w:pPr>
+      <w:spacing w:before="0" w:after="800"/>
+    </w:pPr>
+    <w:r>
+      <w:rPr>
+        <w:noProof/>
+      </w:rPr>
+      <w:drawing>
+        <wp:inline distT="0" distB="0" distL="0" distR="0">
+          <wp:extent cx="5943600" cy="28575"/>
+          <wp:effectExtent l="0" t="0" r="0" b="0"/>
+          <wp:docPr id="3" name="blue-line"/>
+          <wp:cNvGraphicFramePr>
+            <a:graphicFrameLocks xmlns:a="http://schemas.openxmlformats.org/drawingml/2006/main" noChangeAspect="1"/>
+          </wp:cNvGraphicFramePr>
+          <a:graphic xmlns:a="http://schemas.openxmlformats.org/drawingml/2006/main">
+            <a:graphicData uri="http://schemas.microsoft.com/office/word/2010/wordprocessingShape">
+              <wps:wsp xmlns:wps="http://schemas.microsoft.com/office/word/2010/wordprocessingShape">
+                <wps:cNvSpPr>
+                  <a:spLocks noChangeArrowheads="1"/>
+                </wps:cNvSpPr>
+                <wps:spPr>
+                  <a:xfrm>
+                    <a:off x="0" y="0"/>
+                    <a:ext cx="5943600" cy="28575"/>
+                  </a:xfrm>
+                  <a:prstGeom prst="rect">
+                    <a:avLst/>
+                  </a:prstGeom>
+                  <a:solidFill>
+                    <a:srgbClr val="2E74B5"/>
+                  </a:solidFill>
+                  <a:ln>
+                    <a:noFill/>
+                  </a:ln>
+                </wps:spPr>
+                <wps:bodyPr lIns="0" rIns="0" tIns="0" bIns="0" anchor="t"/>
+              </wps:wsp>
+            </a:graphicData>
+          </a:graphic>
+        </wp:inline>
+      </w:drawing>
+    </w:r>
     <w:r>
       <w:rPr>
         <w:noProof/>
@@ -2538,9 +2583,9 @@
             <wp:align>right</wp:align>
           </wp:positionH>
           <wp:positionV relativeFrom="paragraph">
-            <wp:posOffset>-205000</wp:posOffset>
+            <wp:posOffset>-215900</wp:posOffset>
           </wp:positionV>
-          <wp:extent cx="1585595" cy="920750"/>
+          <wp:extent cx="792797" cy="460375"/>
           <wp:effectExtent l="0" t="0" r="0" b="0"/>
           <wp:wrapNone/>
           <wp:docPr id="2" name="emc2-logo"/>
@@ -2565,7 +2610,7 @@
                 <pic:spPr bwMode="auto">
                   <a:xfrm>
                     <a:off x="0" y="0"/>
-                    <a:ext cx="1585595" cy="920750"/>
+                    <a:ext cx="792797" cy="460375"/>
                   </a:xfrm>
                   <a:prstGeom prst="rect">
                     <a:avLst/>
@@ -2575,51 +2620,6 @@
             </a:graphicData>
           </a:graphic>
         </wp:anchor>
-      </w:drawing>
-    </w:r>
-  </w:p>
-  <w:p>
-    <w:pPr>
-      <w:spacing w:before="0" w:after="80"/>
-    </w:pPr>
-    <w:r>
-      <w:rPr>
-        <w:noProof/>
-      </w:rPr>
-      <w:drawing>
-        <wp:inline distT="0" distB="0" distL="0" distR="0">
-          <wp:extent cx="4286250" cy="28575"/>
-          <wp:effectExtent l="0" t="0" r="0" b="0"/>
-          <wp:docPr id="3" name="blue-line"/>
-          <wp:cNvGraphicFramePr>
-            <a:graphicFrameLocks xmlns:a="http://schemas.openxmlformats.org/drawingml/2006/main" noChangeAspect="1"/>
-          </wp:cNvGraphicFramePr>
-          <a:graphic xmlns:a="http://schemas.openxmlformats.org/drawingml/2006/main">
-            <a:graphicData uri="http://schemas.microsoft.com/office/word/2010/wordprocessingShape">
-              <wps:wsp xmlns:wps="http://schemas.microsoft.com/office/word/2010/wordprocessingShape">
-                <wps:cNvSpPr>
-                  <a:spLocks noChangeArrowheads="1"/>
-                </wps:cNvSpPr>
-                <wps:spPr>
-                  <a:xfrm>
-                    <a:off x="0" y="0"/>
-                    <a:ext cx="4286250" cy="28575"/>
-                  </a:xfrm>
-                  <a:prstGeom prst="rect">
-                    <a:avLst/>
-                  </a:prstGeom>
-                  <a:solidFill>
-                    <a:srgbClr val="2E74B5"/>
-                  </a:solidFill>
-                  <a:ln>
-                    <a:noFill/>
-                  </a:ln>
-                </wps:spPr>
-                <wps:bodyPr lIns="0" rIns="0" tIns="0" bIns="0" anchor="t"/>
-              </wps:wsp>
-            </a:graphicData>
-          </a:graphic>
-        </wp:inline>
       </w:drawing>
     </w:r>
   </w:p>
@@ -2658,6 +2658,51 @@
       </w:rPr>
       <w:t xml:space="preserve">EmC2  Alltagshilfe</w:t>
     </w:r>
+  </w:p>
+  <w:p>
+    <w:pPr>
+      <w:spacing w:before="0" w:after="800"/>
+    </w:pPr>
+    <w:r>
+      <w:rPr>
+        <w:noProof/>
+      </w:rPr>
+      <w:drawing>
+        <wp:inline distT="0" distB="0" distL="0" distR="0">
+          <wp:extent cx="5943600" cy="28575"/>
+          <wp:effectExtent l="0" t="0" r="0" b="0"/>
+          <wp:docPr id="3" name="blue-line"/>
+          <wp:cNvGraphicFramePr>
+            <a:graphicFrameLocks xmlns:a="http://schemas.openxmlformats.org/drawingml/2006/main" noChangeAspect="1"/>
+          </wp:cNvGraphicFramePr>
+          <a:graphic xmlns:a="http://schemas.openxmlformats.org/drawingml/2006/main">
+            <a:graphicData uri="http://schemas.microsoft.com/office/word/2010/wordprocessingShape">
+              <wps:wsp xmlns:wps="http://schemas.microsoft.com/office/word/2010/wordprocessingShape">
+                <wps:cNvSpPr>
+                  <a:spLocks noChangeArrowheads="1"/>
+                </wps:cNvSpPr>
+                <wps:spPr>
+                  <a:xfrm>
+                    <a:off x="0" y="0"/>
+                    <a:ext cx="5943600" cy="28575"/>
+                  </a:xfrm>
+                  <a:prstGeom prst="rect">
+                    <a:avLst/>
+                  </a:prstGeom>
+                  <a:solidFill>
+                    <a:srgbClr val="2E74B5"/>
+                  </a:solidFill>
+                  <a:ln>
+                    <a:noFill/>
+                  </a:ln>
+                </wps:spPr>
+                <wps:bodyPr lIns="0" rIns="0" tIns="0" bIns="0" anchor="t"/>
+              </wps:wsp>
+            </a:graphicData>
+          </a:graphic>
+        </wp:inline>
+      </w:drawing>
+    </w:r>
     <w:r>
       <w:rPr>
         <w:noProof/>
@@ -2669,9 +2714,9 @@
             <wp:align>right</wp:align>
           </wp:positionH>
           <wp:positionV relativeFrom="paragraph">
-            <wp:posOffset>-205000</wp:posOffset>
+            <wp:posOffset>-215900</wp:posOffset>
           </wp:positionV>
-          <wp:extent cx="1585595" cy="920750"/>
+          <wp:extent cx="792797" cy="460375"/>
           <wp:effectExtent l="0" t="0" r="0" b="0"/>
           <wp:wrapNone/>
           <wp:docPr id="2" name="emc2-logo"/>
@@ -2696,7 +2741,7 @@
                 <pic:spPr bwMode="auto">
                   <a:xfrm>
                     <a:off x="0" y="0"/>
-                    <a:ext cx="1585595" cy="920750"/>
+                    <a:ext cx="792797" cy="460375"/>
                   </a:xfrm>
                   <a:prstGeom prst="rect">
                     <a:avLst/>
@@ -2706,51 +2751,6 @@
             </a:graphicData>
           </a:graphic>
         </wp:anchor>
-      </w:drawing>
-    </w:r>
-  </w:p>
-  <w:p>
-    <w:pPr>
-      <w:spacing w:before="0" w:after="80"/>
-    </w:pPr>
-    <w:r>
-      <w:rPr>
-        <w:noProof/>
-      </w:rPr>
-      <w:drawing>
-        <wp:inline distT="0" distB="0" distL="0" distR="0">
-          <wp:extent cx="4286250" cy="28575"/>
-          <wp:effectExtent l="0" t="0" r="0" b="0"/>
-          <wp:docPr id="3" name="blue-line"/>
-          <wp:cNvGraphicFramePr>
-            <a:graphicFrameLocks xmlns:a="http://schemas.openxmlformats.org/drawingml/2006/main" noChangeAspect="1"/>
-          </wp:cNvGraphicFramePr>
-          <a:graphic xmlns:a="http://schemas.openxmlformats.org/drawingml/2006/main">
-            <a:graphicData uri="http://schemas.microsoft.com/office/word/2010/wordprocessingShape">
-              <wps:wsp xmlns:wps="http://schemas.microsoft.com/office/word/2010/wordprocessingShape">
-                <wps:cNvSpPr>
-                  <a:spLocks noChangeArrowheads="1"/>
-                </wps:cNvSpPr>
-                <wps:spPr>
-                  <a:xfrm>
-                    <a:off x="0" y="0"/>
-                    <a:ext cx="4286250" cy="28575"/>
-                  </a:xfrm>
-                  <a:prstGeom prst="rect">
-                    <a:avLst/>
-                  </a:prstGeom>
-                  <a:solidFill>
-                    <a:srgbClr val="2E74B5"/>
-                  </a:solidFill>
-                  <a:ln>
-                    <a:noFill/>
-                  </a:ln>
-                </wps:spPr>
-                <wps:bodyPr lIns="0" rIns="0" tIns="0" bIns="0" anchor="t"/>
-              </wps:wsp>
-            </a:graphicData>
-          </a:graphic>
-        </wp:inline>
       </w:drawing>
     </w:r>
   </w:p>

</xml_diff>